<commit_message>
feat: add K8s Prometheus manifests, update docs with K8s monitoring setup
</commit_message>
<xml_diff>
--- a/Documentation/Heart_Disease_MLOps_Report.docx
+++ b/Documentation/Heart_Disease_MLOps_Report.docx
@@ -3664,69 +3664,24 @@
       </w:r>
     </w:p>
     <w:p>
-      <w:pPr>
-        <w:pStyle w:val="ListBullet"/>
-        <w:ind w:left="360"/>
-      </w:pPr>
       <w:r>
-        <w:t>Liveness probe: GET /health (delay=10s, period=30s)</w:t>
+        <w:t>NAME                                TYPE           CLUSTER-IP     EXTERNAL-IP   PORT(S)</w:t>
       </w:r>
     </w:p>
     <w:p>
-      <w:pPr>
-        <w:pStyle w:val="ListBullet"/>
-        <w:ind w:left="360"/>
-      </w:pPr>
       <w:r>
-        <w:t>Readiness probe: GET /health (delay=5s, period=10s)</w:t>
+        <w:t>service/heart-disease-api-service   LoadBalancer   10.105.51.75   &lt;pending&gt;     80:31725/TCP</w:t>
       </w:r>
     </w:p>
     <w:p>
-      <w:pPr>
-        <w:pStyle w:val="ListBullet"/>
-        <w:ind w:left="360"/>
-      </w:pPr>
       <w:r>
-        <w:t>Resource requests: 250m CPU, 256Mi memory</w:t>
+        <w:t>NAME                                READY   UP-TO-DATE   AVAILABLE   AGE</w:t>
       </w:r>
     </w:p>
     <w:p>
-      <w:pPr>
-        <w:pStyle w:val="ListBullet"/>
-        <w:ind w:left="360"/>
-      </w:pPr>
       <w:r>
-        <w:t>Resource limits: 500m CPU, 512Mi memory</w:t>
+        <w:t>deployment.apps/heart-disease-api   2/2     2            2           20s</w:t>
       </w:r>
-    </w:p>
-    <w:p>
-      <w:r/>
-      <w:r>
-        <w:rPr>
-          <w:b/>
-        </w:rPr>
-        <w:t>service.yaml:</w:t>
-      </w:r>
-      <w:r/>
-    </w:p>
-    <w:p>
-      <w:pPr>
-        <w:pStyle w:val="ListBullet"/>
-        <w:ind w:left="360"/>
-      </w:pPr>
-      <w:r>
-        <w:t>LoadBalancer service exposing port 80 → container port 8000</w:t>
-      </w:r>
-    </w:p>
-    <w:p>
-      <w:r/>
-      <w:r>
-        <w:rPr>
-          <w:b/>
-        </w:rPr>
-        <w:t>Verified K8s deployment:</w:t>
-      </w:r>
-      <w:r/>
     </w:p>
     <w:p>
       <w:pPr>
@@ -3738,249 +3693,86 @@
           <w:color w:val="333333"/>
           <w:sz w:val="16"/>
         </w:rPr>
-        <w:t>NAME                                     READY   STATUS    RESTARTS   AGE</w:t>
         <w:br/>
-        <w:t>pod/heart-disease-api-7b5bc5b856-4fch6   1/1     Running   0          20s</w:t>
-        <w:br/>
-        <w:t>pod/heart-disease-api-7b5bc5b856-7phtg   1/1     Running   0          20s</w:t>
+        <w:t>---</w:t>
         <w:br/>
         <w:br/>
-        <w:t>NAME                                TYPE           CLUSTER-IP     EXTERNAL-IP   PORT(S)</w:t>
-        <w:br/>
-        <w:t>service/heart-disease-api-service   LoadBalancer   10.105.51.75   &lt;pending&gt;     80:31725/TCP</w:t>
+        <w:t>## 10. Monitoring &amp; Logging</w:t>
         <w:br/>
         <w:br/>
-        <w:t>NAME                                READY   UP-TO-DATE   AVAILABLE   AGE</w:t>
+        <w:t>### 10.1 Application Logging</w:t>
         <w:br/>
-        <w:t>deployment.apps/heart-disease-api   2/2     2            2           20s</w:t>
+        <w:br/>
+        <w:t>Comprehensive logging is implemented at the API level (`src/api/model_app.py`):</w:t>
+        <w:br/>
+        <w:t>- All requests are logged with timestamp, method, endpoint, and status</w:t>
+        <w:br/>
+        <w:t>- Prediction requests log input data, prediction result, confidence, and latency</w:t>
+        <w:br/>
+        <w:t>- Logs are written to both console (stdout) and file (`api.log`)</w:t>
+        <w:br/>
+        <w:t>- Log format: `%(asctime)s - %(name)s - %(levelname)s - %(message)s`</w:t>
+        <w:br/>
+        <w:br/>
+        <w:t>### 10.2 Prometheus Metrics</w:t>
+        <w:br/>
+        <w:br/>
+        <w:t>The `/metrics` endpoint exposes production-grade metrics:</w:t>
+        <w:br/>
+        <w:br/>
+        <w:t>- **`predictions_total`** — Counter of total predictions, labeled by result (Heart Disease / No Heart Disease)</w:t>
+        <w:br/>
+        <w:t>- **`prediction_latency_seconds`** — Histogram of prediction processing time</w:t>
+        <w:br/>
+        <w:t>- **`http_requests_total`** — Counter of all HTTP requests, labeled by method, endpoint, and status code</w:t>
+        <w:br/>
+        <w:br/>
+        <w:t>Prometheus scrape configuration:</w:t>
+        <w:br/>
+        <w:br/>
+        <w:t>**Docker Compose** (`monitoring/prometheus.yml`):</w:t>
+        <w:br/>
+        <w:t>- Scrape interval: 15 seconds</w:t>
+        <w:br/>
+        <w:t>- Target: `heart-disease-api:8000` (Docker Compose service DNS)</w:t>
+        <w:br/>
+        <w:t>- Metrics path: `/metrics`</w:t>
+        <w:br/>
+        <w:br/>
+        <w:t>**Kubernetes** (`k8s/prometheus-config.yaml` + `k8s/prometheus-deployment.yaml`):</w:t>
+        <w:br/>
+        <w:t>- Scrape interval: 15 seconds</w:t>
+        <w:br/>
+        <w:t>- Target: `heart-disease-api-service:80` (K8s service DNS)</w:t>
+        <w:br/>
+        <w:t>- Metrics path: `/metrics`</w:t>
+        <w:br/>
+        <w:t>- Deployed as a ConfigMap + Deployment + NodePort Service</w:t>
+        <w:br/>
       </w:r>
     </w:p>
     <w:p>
       <w:pPr>
-        <w:pStyle w:val="Heading1"/>
+        <w:pStyle w:val="Title"/>
+        <w:jc w:val="center"/>
       </w:pPr>
       <w:r>
-        <w:t>10. Monitoring &amp; Logging</w:t>
-      </w:r>
-    </w:p>
-    <w:p>
-      <w:pPr>
-        <w:pStyle w:val="Heading2"/>
-      </w:pPr>
-      <w:r>
-        <w:t>10.1 Application Logging</w:t>
+        <w:t>Deploy Prometheus on Kubernetes</w:t>
       </w:r>
     </w:p>
     <w:p>
       <w:r>
-        <w:t>Comprehensive logging is implemented at the API level (src/api/model_app.py):</w:t>
-      </w:r>
-    </w:p>
-    <w:p>
-      <w:pPr>
-        <w:pStyle w:val="ListBullet"/>
-        <w:ind w:left="360"/>
-      </w:pPr>
-      <w:r>
-        <w:t>All requests are logged with timestamp, method, endpoint, and status</w:t>
-      </w:r>
-    </w:p>
-    <w:p>
-      <w:pPr>
-        <w:pStyle w:val="ListBullet"/>
-        <w:ind w:left="360"/>
-      </w:pPr>
-      <w:r>
-        <w:t>Prediction requests log input data, prediction result, confidence, and latency</w:t>
-      </w:r>
-    </w:p>
-    <w:p>
-      <w:pPr>
-        <w:pStyle w:val="ListBullet"/>
-        <w:ind w:left="360"/>
-      </w:pPr>
-      <w:r>
-        <w:t>Logs are written to both console (stdout) and file (api.log)</w:t>
-      </w:r>
-    </w:p>
-    <w:p>
-      <w:pPr>
-        <w:pStyle w:val="ListBullet"/>
-        <w:ind w:left="360"/>
-      </w:pPr>
-      <w:r>
-        <w:t>Log format: %(asctime)s - %(name)s - %(levelname)s - %(message)s</w:t>
-      </w:r>
-    </w:p>
-    <w:p>
-      <w:pPr>
-        <w:pStyle w:val="Heading2"/>
-      </w:pPr>
-      <w:r>
-        <w:t>10.2 Prometheus Metrics</w:t>
+        <w:t>kubectl apply -f k8s/prometheus-config.yaml</w:t>
       </w:r>
     </w:p>
     <w:p>
       <w:r>
-        <w:t>The /metrics endpoint exposes production-grade metrics:</w:t>
-      </w:r>
-    </w:p>
-    <w:p>
-      <w:pPr>
-        <w:pStyle w:val="ListBullet"/>
-        <w:ind w:left="360"/>
-      </w:pPr>
-      <w:r/>
-      <w:r>
-        <w:rPr>
-          <w:b/>
-        </w:rPr>
-        <w:t>predictions_total</w:t>
-      </w:r>
-      <w:r>
-        <w:t xml:space="preserve"> — Counter of total predictions, labeled by result (Heart Disease / No Heart Disease)</w:t>
-      </w:r>
-    </w:p>
-    <w:p>
-      <w:pPr>
-        <w:pStyle w:val="ListBullet"/>
-        <w:ind w:left="360"/>
-      </w:pPr>
-      <w:r/>
-      <w:r>
-        <w:rPr>
-          <w:b/>
-        </w:rPr>
-        <w:t>prediction_latency_seconds</w:t>
-      </w:r>
-      <w:r>
-        <w:t xml:space="preserve"> — Histogram of prediction processing time</w:t>
-      </w:r>
-    </w:p>
-    <w:p>
-      <w:pPr>
-        <w:pStyle w:val="ListBullet"/>
-        <w:ind w:left="360"/>
-      </w:pPr>
-      <w:r/>
-      <w:r>
-        <w:rPr>
-          <w:b/>
-        </w:rPr>
-        <w:t>http_requests_total</w:t>
-      </w:r>
-      <w:r>
-        <w:t xml:space="preserve"> — Counter of all HTTP requests, labeled by method, endpoint, and status code</w:t>
+        <w:t>kubectl apply -f k8s/prometheus-deployment.yaml</w:t>
       </w:r>
     </w:p>
     <w:p>
       <w:r>
-        <w:t>Prometheus scrape configuration (monitoring/prometheus.yml):</w:t>
-      </w:r>
-    </w:p>
-    <w:p>
-      <w:pPr>
-        <w:pStyle w:val="ListBullet"/>
-        <w:ind w:left="360"/>
-      </w:pPr>
-      <w:r>
-        <w:t>Scrape interval: 15 seconds</w:t>
-      </w:r>
-    </w:p>
-    <w:p>
-      <w:pPr>
-        <w:pStyle w:val="ListBullet"/>
-        <w:ind w:left="360"/>
-      </w:pPr>
-      <w:r>
-        <w:t>Target: heart-disease-api:8000</w:t>
-      </w:r>
-    </w:p>
-    <w:p>
-      <w:pPr>
-        <w:pStyle w:val="ListBullet"/>
-        <w:ind w:left="360"/>
-      </w:pPr>
-      <w:r>
-        <w:t>Metrics path: /metrics</w:t>
-      </w:r>
-    </w:p>
-    <w:p>
-      <w:pPr>
-        <w:pStyle w:val="Heading2"/>
-      </w:pPr>
-      <w:r>
-        <w:t>10.3 Grafana Dashboard</w:t>
-      </w:r>
-    </w:p>
-    <w:p>
-      <w:r>
-        <w:t>A pre-provisioned Grafana dashboard ("Heart Disease API Monitoring") is auto-loaded with panels for:</w:t>
-      </w:r>
-    </w:p>
-    <w:p>
-      <w:pPr>
-        <w:pStyle w:val="ListBullet"/>
-        <w:ind w:left="360"/>
-      </w:pPr>
-      <w:r>
-        <w:t>Total predictions count</w:t>
-      </w:r>
-    </w:p>
-    <w:p>
-      <w:pPr>
-        <w:pStyle w:val="ListBullet"/>
-        <w:ind w:left="360"/>
-      </w:pPr>
-      <w:r>
-        <w:t>Predictions rate by result</w:t>
-      </w:r>
-    </w:p>
-    <w:p>
-      <w:pPr>
-        <w:pStyle w:val="ListBullet"/>
-        <w:ind w:left="360"/>
-      </w:pPr>
-      <w:r>
-        <w:t>Prediction latency (p95)</w:t>
-      </w:r>
-    </w:p>
-    <w:p>
-      <w:pPr>
-        <w:pStyle w:val="ListBullet"/>
-        <w:ind w:left="360"/>
-      </w:pPr>
-      <w:r>
-        <w:t>HTTP request rate by method/endpoint/status</w:t>
-      </w:r>
-    </w:p>
-    <w:p>
-      <w:pPr>
-        <w:pStyle w:val="ListBullet"/>
-        <w:ind w:left="360"/>
-      </w:pPr>
-      <w:r>
-        <w:t>Average prediction latency over time</w:t>
-      </w:r>
-    </w:p>
-    <w:p>
-      <w:r/>
-      <w:r>
-        <w:rPr>
-          <w:b/>
-        </w:rPr>
-        <w:t>Grafana access:</w:t>
-      </w:r>
-      <w:r>
-        <w:t xml:space="preserve"> http://localhost:3000 (Credentials: admin / admin)</w:t>
-      </w:r>
-    </w:p>
-    <w:p>
-      <w:pPr>
-        <w:pStyle w:val="Heading1"/>
-      </w:pPr>
-      <w:r>
-        <w:t>11. Architecture Diagram</w:t>
+        <w:t>minikube service prometheus-service</w:t>
       </w:r>
     </w:p>
     <w:p>
@@ -3993,788 +3785,98 @@
           <w:color w:val="333333"/>
           <w:sz w:val="16"/>
         </w:rPr>
-        <w:t>┌─────────────┐     ┌──────────────┐     ┌─────────────────┐     ┌──────────────┐</w:t>
         <w:br/>
-        <w:t>│  Data (CSV)  │────▶│  Preprocess   │────▶│  Train + MLflow  │────▶│  Model (.pkl) │</w:t>
+        <w:t>### 10.3 Grafana Dashboard</w:t>
         <w:br/>
-        <w:t>└─────────────┘     └──────────────┘     └─────────────────┘     └──────┬───────┘</w:t>
         <w:br/>
-        <w:t xml:space="preserve">                                                                        │</w:t>
+        <w:t>A pre-provisioned Grafana dashboard ("Heart Disease API Monitoring") is auto-loaded with panels for:</w:t>
         <w:br/>
-        <w:t xml:space="preserve">                    ┌──────────────┐     ┌─────────────────┐           │</w:t>
+        <w:t>- Total predictions count</w:t>
         <w:br/>
-        <w:t xml:space="preserve">                    │   Prometheus  │◀────│  FastAPI + Docker │◀──────────┘</w:t>
+        <w:t>- Predictions rate by result</w:t>
         <w:br/>
-        <w:t xml:space="preserve">                    │   /metrics    │     │  /predict        │</w:t>
+        <w:t>- Prediction latency (p95)</w:t>
         <w:br/>
-        <w:t xml:space="preserve">                    └──────┬───────┘     └────────┬────────┘</w:t>
+        <w:t>- HTTP request rate by method/endpoint/status</w:t>
         <w:br/>
-        <w:t xml:space="preserve">                           │                      │</w:t>
+        <w:t>- Average prediction latency over time</w:t>
         <w:br/>
-        <w:t xml:space="preserve">                    ┌──────▼───────┐     ┌────────▼────────┐</w:t>
         <w:br/>
-        <w:t xml:space="preserve">                    │   Grafana     │     │  Kubernetes (K8s)│</w:t>
+        <w:t>**Grafana access:** http://localhost:3000 (Credentials: admin / admin)</w:t>
         <w:br/>
-        <w:t xml:space="preserve">                    │   Dashboard   │     │  LoadBalancer     │</w:t>
         <w:br/>
-        <w:t xml:space="preserve">                    └──────────────┘     └─────────────────┘</w:t>
-      </w:r>
-    </w:p>
-    <w:p>
-      <w:r/>
-      <w:r>
-        <w:rPr>
-          <w:b/>
-        </w:rPr>
-        <w:t>Pipeline Flow:</w:t>
-      </w:r>
-      <w:r/>
-    </w:p>
-    <w:p>
-      <w:r>
-        <w:t xml:space="preserve">1. </w:t>
-      </w:r>
-      <w:r>
-        <w:rPr>
-          <w:b/>
-        </w:rPr>
-        <w:t>Data Layer:</w:t>
-      </w:r>
-      <w:r>
-        <w:t xml:space="preserve"> data/heart.csv → src/data/preprocess.py (load, clean, impute)</w:t>
+        <w:t>---</w:t>
+        <w:br/>
+        <w:br/>
+        <w:t>## 11. Architecture Diagram</w:t>
+        <w:br/>
       </w:r>
     </w:p>
     <w:p>
       <w:r>
-        <w:t xml:space="preserve">2. </w:t>
-      </w:r>
-      <w:r>
-        <w:rPr>
-          <w:b/>
-        </w:rPr>
-        <w:t>Training Layer:</w:t>
-      </w:r>
-      <w:r>
-        <w:t xml:space="preserve"> src/models/train.py (GridSearchCV + MLflow tracking) → heart_model.pkl</w:t>
+        <w:t>┌─────────────┐     ┌──────────────┐     ┌─────────────────┐     ┌──────────────┐</w:t>
       </w:r>
     </w:p>
     <w:p>
       <w:r>
-        <w:t xml:space="preserve">3. </w:t>
-      </w:r>
-      <w:r>
-        <w:rPr>
-          <w:b/>
-        </w:rPr>
-        <w:t>Inference Layer:</w:t>
-      </w:r>
-      <w:r>
-        <w:t xml:space="preserve"> src/models/inference.py (HeartDiseasePredictor class)</w:t>
+        <w:t>│  Data (CSV)  │────▶│  Preprocess   │────▶│  Train + MLflow  │────▶│  Model (.pkl) │</w:t>
       </w:r>
     </w:p>
     <w:p>
       <w:r>
-        <w:t xml:space="preserve">4. </w:t>
-      </w:r>
-      <w:r>
-        <w:rPr>
-          <w:b/>
-        </w:rPr>
-        <w:t>API Layer:</w:t>
-      </w:r>
-      <w:r>
-        <w:t xml:space="preserve"> src/api/model_app.py (FastAPI) + src/api/app.py (Flask UI)</w:t>
+        <w:t>└─────────────┘     └──────────────┘     └─────────────────┘     └──────┬───────┘</w:t>
       </w:r>
     </w:p>
     <w:p>
       <w:r>
-        <w:t xml:space="preserve">5. </w:t>
-      </w:r>
-      <w:r>
-        <w:rPr>
-          <w:b/>
-        </w:rPr>
-        <w:t>CI/CD Layer:</w:t>
-      </w:r>
-      <w:r>
-        <w:t xml:space="preserve"> .github/workflows/ci.yml (Lint → Test → Train → Docker)</w:t>
+        <w:t>│</w:t>
       </w:r>
     </w:p>
     <w:p>
       <w:r>
-        <w:t xml:space="preserve">6. </w:t>
-      </w:r>
-      <w:r>
-        <w:rPr>
-          <w:b/>
-        </w:rPr>
-        <w:t>Deployment Layer:</w:t>
-      </w:r>
-      <w:r>
-        <w:t xml:space="preserve"> Docker Compose (API + Prometheus + Grafana) / Kubernetes (Minikube)</w:t>
+        <w:t>┌──────────────┐     ┌─────────────────┐           │</w:t>
       </w:r>
     </w:p>
     <w:p>
       <w:r>
-        <w:t xml:space="preserve">7. </w:t>
-      </w:r>
-      <w:r>
-        <w:rPr>
-          <w:b/>
-        </w:rPr>
-        <w:t>Monitoring Layer:</w:t>
-      </w:r>
-      <w:r>
-        <w:t xml:space="preserve"> Prometheus metrics + Grafana dashboards + application logging</w:t>
-      </w:r>
-    </w:p>
-    <w:p>
-      <w:pPr>
-        <w:pStyle w:val="Heading1"/>
-      </w:pPr>
-      <w:r>
-        <w:t>12. Conclusion &amp; Future Work</w:t>
-      </w:r>
-    </w:p>
-    <w:p>
-      <w:pPr>
-        <w:pStyle w:val="Heading2"/>
-      </w:pPr>
-      <w:r>
-        <w:t>12.1 Summary</w:t>
+        <w:t>│   Prometheus  │◀────│  FastAPI + Docker │◀──────────┘</w:t>
       </w:r>
     </w:p>
     <w:p>
       <w:r>
-        <w:t>This project successfully demonstrates a complete MLOps pipeline for heart disease prediction, covering all aspects of production-grade machine learning:</w:t>
+        <w:t>│   /metrics    │     │  /predict        │</w:t>
       </w:r>
     </w:p>
     <w:p>
-      <w:pPr>
-        <w:pStyle w:val="ListBullet"/>
-        <w:ind w:left="360"/>
-      </w:pPr>
-      <w:r/>
       <w:r>
-        <w:rPr>
-          <w:b/>
-        </w:rPr>
-        <w:t>Data Pipeline:</w:t>
-      </w:r>
-      <w:r>
-        <w:t xml:space="preserve"> Automated data loading, cleaning, and preprocessing with missing value imputation</w:t>
+        <w:t>└──────┬───────┘     └────────┬────────┘</w:t>
       </w:r>
     </w:p>
     <w:p>
-      <w:pPr>
-        <w:pStyle w:val="ListBullet"/>
-        <w:ind w:left="360"/>
-      </w:pPr>
-      <w:r/>
       <w:r>
-        <w:rPr>
-          <w:b/>
-        </w:rPr>
-        <w:t>Model Development:</w:t>
-      </w:r>
-      <w:r>
-        <w:t xml:space="preserve"> Trained and compared 2 classification models with GridSearchCV and 5-fold stratified cross-validation, achieving ~0.90 ROC-AUC with Logistic Regression</w:t>
+        <w:t>│                      │</w:t>
       </w:r>
     </w:p>
     <w:p>
-      <w:pPr>
-        <w:pStyle w:val="ListBullet"/>
-        <w:ind w:left="360"/>
-      </w:pPr>
-      <w:r/>
       <w:r>
-        <w:rPr>
-          <w:b/>
-        </w:rPr>
-        <w:t>Experiment Tracking:</w:t>
-      </w:r>
-      <w:r>
-        <w:t xml:space="preserve"> Full MLflow integration with parameter, metric, and artifact logging across all experimental runs</w:t>
+        <w:t>┌──────▼───────┐     ┌────────▼────────┐</w:t>
       </w:r>
     </w:p>
     <w:p>
-      <w:pPr>
-        <w:pStyle w:val="ListBullet"/>
-        <w:ind w:left="360"/>
-      </w:pPr>
-      <w:r/>
       <w:r>
-        <w:rPr>
-          <w:b/>
-        </w:rPr>
-        <w:t>Testing:</w:t>
-      </w:r>
-      <w:r>
-        <w:t xml:space="preserve"> 24 comprehensive unit tests covering data processing, model training, inference, and API functionality</w:t>
+        <w:t>│   Grafana     │     │  Kubernetes (K8s)│</w:t>
       </w:r>
     </w:p>
     <w:p>
-      <w:pPr>
-        <w:pStyle w:val="ListBullet"/>
-        <w:ind w:left="360"/>
-      </w:pPr>
-      <w:r/>
       <w:r>
-        <w:rPr>
-          <w:b/>
-        </w:rPr>
-        <w:t>CI/CD:</w:t>
-      </w:r>
-      <w:r>
-        <w:t xml:space="preserve"> Automated 4-stage GitHub Actions pipeline (Lint → Test → Train → Docker Build &amp; Test)</w:t>
+        <w:t>│   Dashboard   │     │  LoadBalancer     │</w:t>
       </w:r>
     </w:p>
     <w:p>
-      <w:pPr>
-        <w:pStyle w:val="ListBullet"/>
-        <w:ind w:left="360"/>
-      </w:pPr>
-      <w:r/>
       <w:r>
-        <w:rPr>
-          <w:b/>
-        </w:rPr>
-        <w:t>Containerization:</w:t>
-      </w:r>
-      <w:r>
-        <w:t xml:space="preserve"> Production-ready Docker container with FastAPI serving</w:t>
+        <w:t>└──────────────┘     └─────────────────┘</w:t>
       </w:r>
     </w:p>
-    <w:p>
-      <w:pPr>
-        <w:pStyle w:val="ListBullet"/>
-        <w:ind w:left="360"/>
-      </w:pPr>
-      <w:r/>
-      <w:r>
-        <w:rPr>
-          <w:b/>
-        </w:rPr>
-        <w:t>Deployment:</w:t>
-      </w:r>
-      <w:r>
-        <w:t xml:space="preserve"> Kubernetes deployment with 2 replicas, health probes, and resource limits; Docker Compose stack with full monitoring</w:t>
-      </w:r>
-    </w:p>
-    <w:p>
-      <w:pPr>
-        <w:pStyle w:val="ListBullet"/>
-        <w:ind w:left="360"/>
-      </w:pPr>
-      <w:r/>
-      <w:r>
-        <w:rPr>
-          <w:b/>
-        </w:rPr>
-        <w:t>Monitoring:</w:t>
-      </w:r>
-      <w:r>
-        <w:t xml:space="preserve"> Prometheus metrics, Grafana dashboards, and structured logging for production observability</w:t>
-      </w:r>
-    </w:p>
-    <w:p>
-      <w:pPr>
-        <w:pStyle w:val="Heading2"/>
-      </w:pPr>
-      <w:r>
-        <w:t>12.2 Challenges Faced</w:t>
-      </w:r>
-    </w:p>
-    <w:p>
-      <w:pPr>
-        <w:pStyle w:val="ListBullet"/>
-        <w:ind w:left="360"/>
-      </w:pPr>
-      <w:r/>
-      <w:r>
-        <w:rPr>
-          <w:b/>
-        </w:rPr>
-        <w:t>Package Compatibility:</w:t>
-      </w:r>
-      <w:r>
-        <w:t xml:space="preserve"> Python 3.14 lacked pre-built wheels for some ML packages. Resolved by using Python 3.11 in Docker and CI/CD while maintaining local 3.14 compatibility.</w:t>
-      </w:r>
-    </w:p>
-    <w:p>
-      <w:pPr>
-        <w:pStyle w:val="ListBullet"/>
-        <w:ind w:left="360"/>
-      </w:pPr>
-      <w:r/>
-      <w:r>
-        <w:rPr>
-          <w:b/>
-        </w:rPr>
-        <w:t>Pipeline Architecture:</w:t>
-      </w:r>
-      <w:r>
-        <w:t xml:space="preserve"> Chose to embed StandardScaler inside the sklearn Pipeline to ensure consistent preprocessing during both training and inference, avoiding train-serve skew.</w:t>
-      </w:r>
-    </w:p>
-    <w:p>
-      <w:pPr>
-        <w:pStyle w:val="ListBullet"/>
-        <w:ind w:left="360"/>
-      </w:pPr>
-      <w:r/>
-      <w:r>
-        <w:rPr>
-          <w:b/>
-        </w:rPr>
-        <w:t>CI/CD Artifact Passing:</w:t>
-      </w:r>
-      <w:r>
-        <w:t xml:space="preserve"> Docker build stage needed the trained model from the training stage. Resolved by using GitHub Actions upload-artifact / download-artifact for cross-job artifact transfer.</w:t>
-      </w:r>
-    </w:p>
-    <w:p>
-      <w:pPr>
-        <w:pStyle w:val="ListBullet"/>
-        <w:ind w:left="360"/>
-      </w:pPr>
-      <w:r/>
-      <w:r>
-        <w:rPr>
-          <w:b/>
-        </w:rPr>
-        <w:t>Kubernetes Local Testing:</w:t>
-      </w:r>
-      <w:r>
-        <w:t xml:space="preserve"> Used Minikube with minikube image load to avoid needing a container registry for local K8s testing.</w:t>
-      </w:r>
-    </w:p>
-    <w:p>
-      <w:pPr>
-        <w:pStyle w:val="Heading2"/>
-      </w:pPr>
-      <w:r>
-        <w:t>12.3 Future Work</w:t>
-      </w:r>
-    </w:p>
-    <w:p>
-      <w:pPr>
-        <w:pStyle w:val="ListBullet"/>
-        <w:ind w:left="360"/>
-      </w:pPr>
-      <w:r>
-        <w:t>Add Gradient Boosting and XGBoost models for comparison</w:t>
-      </w:r>
-    </w:p>
-    <w:p>
-      <w:pPr>
-        <w:pStyle w:val="ListBullet"/>
-        <w:ind w:left="360"/>
-      </w:pPr>
-      <w:r>
-        <w:t>Implement model versioning with MLflow Model Registry</w:t>
-      </w:r>
-    </w:p>
-    <w:p>
-      <w:pPr>
-        <w:pStyle w:val="ListBullet"/>
-        <w:ind w:left="360"/>
-      </w:pPr>
-      <w:r>
-        <w:t>Add data drift detection for production monitoring</w:t>
-      </w:r>
-    </w:p>
-    <w:p>
-      <w:pPr>
-        <w:pStyle w:val="ListBullet"/>
-        <w:ind w:left="360"/>
-      </w:pPr>
-      <w:r>
-        <w:t>Deploy to a cloud provider (GCP Cloud Run / AWS ECS) with continuous deployment</w:t>
-      </w:r>
-    </w:p>
-    <w:p>
-      <w:pPr>
-        <w:pStyle w:val="ListBullet"/>
-        <w:ind w:left="360"/>
-      </w:pPr>
-      <w:r>
-        <w:t>Implement A/B testing framework for model comparison in production</w:t>
-      </w:r>
-    </w:p>
-    <w:p>
-      <w:pPr>
-        <w:pStyle w:val="Heading1"/>
-      </w:pPr>
-      <w:r>
-        <w:t>13. References</w:t>
-      </w:r>
-    </w:p>
-    <w:tbl>
-      <w:tblPr>
-        <w:tblStyle w:val="LightGrid-Accent1"/>
-        <w:tblW w:type="auto" w:w="0"/>
-        <w:jc w:val="center"/>
-        <w:tblLook w:firstColumn="1" w:firstRow="1" w:lastColumn="0" w:lastRow="0" w:noHBand="0" w:noVBand="1" w:val="04A0"/>
-      </w:tblPr>
-      <w:tblGrid>
-        <w:gridCol w:w="4320"/>
-        <w:gridCol w:w="4320"/>
-      </w:tblGrid>
-      <w:tr>
-        <w:tc>
-          <w:tcPr>
-            <w:tcW w:type="dxa" w:w="4320"/>
-          </w:tcPr>
-          <w:p>
-            <w:r/>
-            <w:r>
-              <w:rPr>
-                <w:b/>
-                <w:sz w:val="18"/>
-              </w:rPr>
-              <w:t>Resource</w:t>
-            </w:r>
-          </w:p>
-        </w:tc>
-        <w:tc>
-          <w:tcPr>
-            <w:tcW w:type="dxa" w:w="4320"/>
-          </w:tcPr>
-          <w:p>
-            <w:r/>
-            <w:r>
-              <w:rPr>
-                <w:b/>
-                <w:sz w:val="18"/>
-              </w:rPr>
-              <w:t>Link</w:t>
-            </w:r>
-          </w:p>
-        </w:tc>
-      </w:tr>
-      <w:tr>
-        <w:tc>
-          <w:tcPr>
-            <w:tcW w:type="dxa" w:w="4320"/>
-          </w:tcPr>
-          <w:p>
-            <w:r/>
-            <w:r>
-              <w:rPr>
-                <w:b w:val="0"/>
-                <w:sz w:val="18"/>
-              </w:rPr>
-              <w:t>UCI ML Repository — Heart Disease Dataset</w:t>
-            </w:r>
-          </w:p>
-        </w:tc>
-        <w:tc>
-          <w:tcPr>
-            <w:tcW w:type="dxa" w:w="4320"/>
-          </w:tcPr>
-          <w:p>
-            <w:r/>
-            <w:r>
-              <w:rPr>
-                <w:b w:val="0"/>
-                <w:sz w:val="18"/>
-              </w:rPr>
-              <w:t>https://archive.ics.uci.edu/ml/datasets/heart+Disease</w:t>
-            </w:r>
-          </w:p>
-        </w:tc>
-      </w:tr>
-      <w:tr>
-        <w:tc>
-          <w:tcPr>
-            <w:tcW w:type="dxa" w:w="4320"/>
-          </w:tcPr>
-          <w:p>
-            <w:r/>
-            <w:r>
-              <w:rPr>
-                <w:b w:val="0"/>
-                <w:sz w:val="18"/>
-              </w:rPr>
-              <w:t>Scikit-learn Documentation</w:t>
-            </w:r>
-          </w:p>
-        </w:tc>
-        <w:tc>
-          <w:tcPr>
-            <w:tcW w:type="dxa" w:w="4320"/>
-          </w:tcPr>
-          <w:p>
-            <w:r/>
-            <w:r>
-              <w:rPr>
-                <w:b w:val="0"/>
-                <w:sz w:val="18"/>
-              </w:rPr>
-              <w:t>https://scikit-learn.org/stable/</w:t>
-            </w:r>
-          </w:p>
-        </w:tc>
-      </w:tr>
-      <w:tr>
-        <w:tc>
-          <w:tcPr>
-            <w:tcW w:type="dxa" w:w="4320"/>
-          </w:tcPr>
-          <w:p>
-            <w:r/>
-            <w:r>
-              <w:rPr>
-                <w:b w:val="0"/>
-                <w:sz w:val="18"/>
-              </w:rPr>
-              <w:t>MLflow Documentation</w:t>
-            </w:r>
-          </w:p>
-        </w:tc>
-        <w:tc>
-          <w:tcPr>
-            <w:tcW w:type="dxa" w:w="4320"/>
-          </w:tcPr>
-          <w:p>
-            <w:r/>
-            <w:r>
-              <w:rPr>
-                <w:b w:val="0"/>
-                <w:sz w:val="18"/>
-              </w:rPr>
-              <w:t>https://mlflow.org/docs/latest/index.html</w:t>
-            </w:r>
-          </w:p>
-        </w:tc>
-      </w:tr>
-      <w:tr>
-        <w:tc>
-          <w:tcPr>
-            <w:tcW w:type="dxa" w:w="4320"/>
-          </w:tcPr>
-          <w:p>
-            <w:r/>
-            <w:r>
-              <w:rPr>
-                <w:b w:val="0"/>
-                <w:sz w:val="18"/>
-              </w:rPr>
-              <w:t>FastAPI Documentation</w:t>
-            </w:r>
-          </w:p>
-        </w:tc>
-        <w:tc>
-          <w:tcPr>
-            <w:tcW w:type="dxa" w:w="4320"/>
-          </w:tcPr>
-          <w:p>
-            <w:r/>
-            <w:r>
-              <w:rPr>
-                <w:b w:val="0"/>
-                <w:sz w:val="18"/>
-              </w:rPr>
-              <w:t>https://fastapi.tiangolo.com/</w:t>
-            </w:r>
-          </w:p>
-        </w:tc>
-      </w:tr>
-      <w:tr>
-        <w:tc>
-          <w:tcPr>
-            <w:tcW w:type="dxa" w:w="4320"/>
-          </w:tcPr>
-          <w:p>
-            <w:r/>
-            <w:r>
-              <w:rPr>
-                <w:b w:val="0"/>
-                <w:sz w:val="18"/>
-              </w:rPr>
-              <w:t>Docker Documentation</w:t>
-            </w:r>
-          </w:p>
-        </w:tc>
-        <w:tc>
-          <w:tcPr>
-            <w:tcW w:type="dxa" w:w="4320"/>
-          </w:tcPr>
-          <w:p>
-            <w:r/>
-            <w:r>
-              <w:rPr>
-                <w:b w:val="0"/>
-                <w:sz w:val="18"/>
-              </w:rPr>
-              <w:t>https://docs.docker.com/</w:t>
-            </w:r>
-          </w:p>
-        </w:tc>
-      </w:tr>
-      <w:tr>
-        <w:tc>
-          <w:tcPr>
-            <w:tcW w:type="dxa" w:w="4320"/>
-          </w:tcPr>
-          <w:p>
-            <w:r/>
-            <w:r>
-              <w:rPr>
-                <w:b w:val="0"/>
-                <w:sz w:val="18"/>
-              </w:rPr>
-              <w:t>Kubernetes Documentation</w:t>
-            </w:r>
-          </w:p>
-        </w:tc>
-        <w:tc>
-          <w:tcPr>
-            <w:tcW w:type="dxa" w:w="4320"/>
-          </w:tcPr>
-          <w:p>
-            <w:r/>
-            <w:r>
-              <w:rPr>
-                <w:b w:val="0"/>
-                <w:sz w:val="18"/>
-              </w:rPr>
-              <w:t>https://kubernetes.io/docs/</w:t>
-            </w:r>
-          </w:p>
-        </w:tc>
-      </w:tr>
-      <w:tr>
-        <w:tc>
-          <w:tcPr>
-            <w:tcW w:type="dxa" w:w="4320"/>
-          </w:tcPr>
-          <w:p>
-            <w:r/>
-            <w:r>
-              <w:rPr>
-                <w:b w:val="0"/>
-                <w:sz w:val="18"/>
-              </w:rPr>
-              <w:t>GitHub Actions Documentation</w:t>
-            </w:r>
-          </w:p>
-        </w:tc>
-        <w:tc>
-          <w:tcPr>
-            <w:tcW w:type="dxa" w:w="4320"/>
-          </w:tcPr>
-          <w:p>
-            <w:r/>
-            <w:r>
-              <w:rPr>
-                <w:b w:val="0"/>
-                <w:sz w:val="18"/>
-              </w:rPr>
-              <w:t>https://docs.github.com/en/actions</w:t>
-            </w:r>
-          </w:p>
-        </w:tc>
-      </w:tr>
-      <w:tr>
-        <w:tc>
-          <w:tcPr>
-            <w:tcW w:type="dxa" w:w="4320"/>
-          </w:tcPr>
-          <w:p>
-            <w:r/>
-            <w:r>
-              <w:rPr>
-                <w:b w:val="0"/>
-                <w:sz w:val="18"/>
-              </w:rPr>
-              <w:t>Prometheus Client Python</w:t>
-            </w:r>
-          </w:p>
-        </w:tc>
-        <w:tc>
-          <w:tcPr>
-            <w:tcW w:type="dxa" w:w="4320"/>
-          </w:tcPr>
-          <w:p>
-            <w:r/>
-            <w:r>
-              <w:rPr>
-                <w:b w:val="0"/>
-                <w:sz w:val="18"/>
-              </w:rPr>
-              <w:t>https://github.com/prometheus/client_python</w:t>
-            </w:r>
-          </w:p>
-        </w:tc>
-      </w:tr>
-      <w:tr>
-        <w:tc>
-          <w:tcPr>
-            <w:tcW w:type="dxa" w:w="4320"/>
-          </w:tcPr>
-          <w:p>
-            <w:r/>
-            <w:r>
-              <w:rPr>
-                <w:b w:val="0"/>
-                <w:sz w:val="18"/>
-              </w:rPr>
-              <w:t>Grafana Documentation</w:t>
-            </w:r>
-          </w:p>
-        </w:tc>
-        <w:tc>
-          <w:tcPr>
-            <w:tcW w:type="dxa" w:w="4320"/>
-          </w:tcPr>
-          <w:p>
-            <w:r/>
-            <w:r>
-              <w:rPr>
-                <w:b w:val="0"/>
-                <w:sz w:val="18"/>
-              </w:rPr>
-              <w:t>https://grafana.com/docs/</w:t>
-            </w:r>
-          </w:p>
-        </w:tc>
-      </w:tr>
-      <w:tr>
-        <w:tc>
-          <w:tcPr>
-            <w:tcW w:type="dxa" w:w="4320"/>
-          </w:tcPr>
-          <w:p>
-            <w:r/>
-            <w:r>
-              <w:rPr>
-                <w:b w:val="0"/>
-                <w:sz w:val="18"/>
-              </w:rPr>
-              <w:t>GitHub Repository</w:t>
-            </w:r>
-          </w:p>
-        </w:tc>
-        <w:tc>
-          <w:tcPr>
-            <w:tcW w:type="dxa" w:w="4320"/>
-          </w:tcPr>
-          <w:p>
-            <w:r/>
-            <w:r>
-              <w:rPr>
-                <w:b w:val="0"/>
-                <w:sz w:val="18"/>
-              </w:rPr>
-              <w:t>https://github.com/2025cs05014/MLOPs</w:t>
-            </w:r>
-          </w:p>
-        </w:tc>
-      </w:tr>
-    </w:tbl>
-    <w:p/>
     <w:p>
       <w:r>
         <w:br w:type="page"/>

</xml_diff>